<commit_message>
Rewrite both emails for gratitude and add copyable declaration wording
They are volunteering their time and the emails read as transactional. Gratitude
now opens and closes both, naming the unpaid on-top-of-a-full-job reality
specifically rather than thanking in the abstract.

Both declarations now carry literal copyable text plus tailored prompts for what
to do if it is not accurate, and both state that having something in the funding
line is normal so the blank does not read as a trap.

Tanvi's also apologises for the two weeks of silence after her 6 August message.
Kyle's offers to cut the new control section entirely rather than defend it.

Co-Authored-By: Claude Opus 5 <noreply@anthropic.com>
Claude-Session: https://claude.ai/code/session_01W9UtE7X76spacWeSvBH7tv
</commit_message>
<xml_diff>
--- a/research/Email_Kyle_McMullan_2026-08-21.docx
+++ b/research/Email_Kyle_McMullan_2026-08-21.docx
@@ -43,6 +43,30 @@
         <w:spacing w:after="160" w:line="276" w:lineRule="auto"/>
       </w:pPr>
       <w:r>
+        <w:t xml:space="preserve">First, thank you. You agreed to this back in July on your own time, at a level of seniority</w:t>
+      </w:r>
+    </w:p>
+    <w:p>
+      <w:pPr>
+        <w:spacing w:after="160" w:line="276" w:lineRule="auto"/>
+      </w:pPr>
+      <w:r>
+        <w:t xml:space="preserve">where nobody would have blinked if you had said no, and you have stayed with it since. I am</w:t>
+      </w:r>
+    </w:p>
+    <w:p>
+      <w:pPr>
+        <w:spacing w:after="160" w:line="276" w:lineRule="auto"/>
+      </w:pPr>
+      <w:r>
+        <w:t xml:space="preserve">grateful for that and I want to say so before I ask you for anything else.</w:t>
+      </w:r>
+    </w:p>
+    <w:p>
+      <w:pPr>
+        <w:spacing w:after="160" w:line="276" w:lineRule="auto"/>
+      </w:pPr>
+      <w:r>
         <w:t xml:space="preserve">The employment article is written and I think it landed where you would want it. It is going</w:t>
       </w:r>
     </w:p>
@@ -51,7 +75,7 @@
         <w:spacing w:after="160" w:line="276" w:lineRule="auto"/>
       </w:pPr>
       <w:r>
-        <w:t xml:space="preserve">to ISACA Journal rather than an academic journal, and your section is the reason that works.</w:t>
+        <w:t xml:space="preserve">to ISACA Journal rather than an academic journal, and your material is the reason that works.</w:t>
       </w:r>
     </w:p>
     <w:p>
@@ -115,39 +139,31 @@
         <w:spacing w:after="160" w:line="276" w:lineRule="auto"/>
       </w:pPr>
       <w:r>
-        <w:t xml:space="preserve">Why ISACA and not a journal. I had been aiming academic, and that was wrong. An academic</w:t>
-      </w:r>
-    </w:p>
-    <w:p>
-      <w:pPr>
-        <w:spacing w:after="160" w:line="276" w:lineRule="auto"/>
-      </w:pPr>
-      <w:r>
-        <w:t xml:space="preserve">venue would treat a single practitioner reviewing her own caseload as a limitation to</w:t>
-      </w:r>
-    </w:p>
-    <w:p>
-      <w:pPr>
-        <w:spacing w:after="160" w:line="276" w:lineRule="auto"/>
-      </w:pPr>
-      <w:r>
-        <w:t xml:space="preserve">defend. An audit readership treats it as the normal unit of work, because it is. The piece</w:t>
-      </w:r>
-    </w:p>
-    <w:p>
-      <w:pPr>
-        <w:spacing w:after="160" w:line="276" w:lineRule="auto"/>
-      </w:pPr>
-      <w:r>
-        <w:t xml:space="preserve">is now written for people who examine files for a living, which is your readership rather</w:t>
-      </w:r>
-    </w:p>
-    <w:p>
-      <w:pPr>
-        <w:spacing w:after="160" w:line="276" w:lineRule="auto"/>
-      </w:pPr>
-      <w:r>
-        <w:t xml:space="preserve">than mine.</w:t>
+        <w:t xml:space="preserve">Why ISACA and not a journal. I had been aiming academic and that was my mistake. An academic</w:t>
+      </w:r>
+    </w:p>
+    <w:p>
+      <w:pPr>
+        <w:spacing w:after="160" w:line="276" w:lineRule="auto"/>
+      </w:pPr>
+      <w:r>
+        <w:t xml:space="preserve">venue would treat a single practitioner reviewing her own caseload as a limitation to defend.</w:t>
+      </w:r>
+    </w:p>
+    <w:p>
+      <w:pPr>
+        <w:spacing w:after="160" w:line="276" w:lineRule="auto"/>
+      </w:pPr>
+      <w:r>
+        <w:t xml:space="preserve">An audit readership treats it as the normal unit of work, because it is. The piece is now</w:t>
+      </w:r>
+    </w:p>
+    <w:p>
+      <w:pPr>
+        <w:spacing w:after="160" w:line="276" w:lineRule="auto"/>
+      </w:pPr>
+      <w:r>
+        <w:t xml:space="preserve">written for people who examine files for a living, which is your readership rather than mine.</w:t>
       </w:r>
     </w:p>
     <w:p>
@@ -227,23 +243,39 @@
         <w:spacing w:after="160" w:line="276" w:lineRule="auto"/>
       </w:pPr>
       <w:r>
-        <w:t xml:space="preserve">escalation trigger is naive, tell me and I will rewrite it however you say or take it out.</w:t>
-      </w:r>
-    </w:p>
-    <w:p>
-      <w:pPr>
-        <w:spacing w:after="160" w:line="276" w:lineRule="auto"/>
-      </w:pPr>
-      <w:r>
-        <w:t xml:space="preserve">The draft is attached. It is 2,500 words, which is short for the amount of ground it covers,</w:t>
-      </w:r>
-    </w:p>
-    <w:p>
-      <w:pPr>
-        <w:spacing w:after="160" w:line="276" w:lineRule="auto"/>
-      </w:pPr>
-      <w:r>
-        <w:t xml:space="preserve">so anything you add I will make room for by cutting elsewhere.</w:t>
+        <w:t xml:space="preserve">escalation trigger is naive, tell me and I will rewrite it however you say or cut it</w:t>
+      </w:r>
+    </w:p>
+    <w:p>
+      <w:pPr>
+        <w:spacing w:after="160" w:line="276" w:lineRule="auto"/>
+      </w:pPr>
+      <w:r>
+        <w:t xml:space="preserve">entirely. I would rather lose the section than publish something that reads as written by</w:t>
+      </w:r>
+    </w:p>
+    <w:p>
+      <w:pPr>
+        <w:spacing w:after="160" w:line="276" w:lineRule="auto"/>
+      </w:pPr>
+      <w:r>
+        <w:t xml:space="preserve">someone who has not done the job.</w:t>
+      </w:r>
+    </w:p>
+    <w:p>
+      <w:pPr>
+        <w:spacing w:after="160" w:line="276" w:lineRule="auto"/>
+      </w:pPr>
+      <w:r>
+        <w:t xml:space="preserve">The draft is attached. It is 2,500 words, short for the ground it covers, so anything you add</w:t>
+      </w:r>
+    </w:p>
+    <w:p>
+      <w:pPr>
+        <w:spacing w:after="160" w:line="276" w:lineRule="auto"/>
+      </w:pPr>
+      <w:r>
+        <w:t xml:space="preserve">I will make room for by cutting elsewhere.</w:t>
       </w:r>
     </w:p>
     <w:p>
@@ -293,7 +325,15 @@
         <w:spacing w:after="160" w:line="276" w:lineRule="auto"/>
       </w:pPr>
       <w:r>
-        <w:t xml:space="preserve">   your edits, or your rewrite. Tracked changes on the attachment is perfectly fine.</w:t>
+        <w:t xml:space="preserve">   your edits, or your rewrite. Tracked changes on the attachment is perfectly fine and the</w:t>
+      </w:r>
+    </w:p>
+    <w:p>
+      <w:pPr>
+        <w:spacing w:after="160" w:line="276" w:lineRule="auto"/>
+      </w:pPr>
+      <w:r>
+        <w:t xml:space="preserve">   least work for you.</w:t>
       </w:r>
     </w:p>
     <w:p>
@@ -310,23 +350,23 @@
         <w:spacing w:after="160" w:line="276" w:lineRule="auto"/>
       </w:pPr>
       <w:r>
-        <w:t xml:space="preserve">   examinations, one per failure pattern. No client names, no identifying detail. They are</w:t>
-      </w:r>
-    </w:p>
-    <w:p>
-      <w:pPr>
-        <w:spacing w:after="160" w:line="276" w:lineRule="auto"/>
-      </w:pPr>
-      <w:r>
-        <w:t xml:space="preserve">   not required and I will not hold the article for them, but they would be the best thing in</w:t>
-      </w:r>
-    </w:p>
-    <w:p>
-      <w:pPr>
-        <w:spacing w:after="160" w:line="276" w:lineRule="auto"/>
-      </w:pPr>
-      <w:r>
-        <w:t xml:space="preserve">   the piece.</w:t>
+        <w:t xml:space="preserve">   examinations, one per failure pattern. No client names, no identifying detail. Not</w:t>
+      </w:r>
+    </w:p>
+    <w:p>
+      <w:pPr>
+        <w:spacing w:after="160" w:line="276" w:lineRule="auto"/>
+      </w:pPr>
+      <w:r>
+        <w:t xml:space="preserve">   required and I will not hold the article for them, but they would be the best thing in the</w:t>
+      </w:r>
+    </w:p>
+    <w:p>
+      <w:pPr>
+        <w:spacing w:after="160" w:line="276" w:lineRule="auto"/>
+      </w:pPr>
+      <w:r>
+        <w:t xml:space="preserve">   piece.</w:t>
       </w:r>
     </w:p>
     <w:p>
@@ -335,23 +375,71 @@
         <w:spacing w:after="60"/>
       </w:pPr>
       <w:r>
-        <w:t xml:space="preserve">4. Two declarations the publication asks of every author, in your own words: whether you hold</w:t>
-      </w:r>
-    </w:p>
-    <w:p>
-      <w:pPr>
-        <w:spacing w:after="160" w:line="276" w:lineRule="auto"/>
-      </w:pPr>
-      <w:r>
-        <w:t xml:space="preserve">   any financial or commercial interest in the Justification Review Standard, and whether you</w:t>
-      </w:r>
-    </w:p>
-    <w:p>
-      <w:pPr>
-        <w:spacing w:after="160" w:line="276" w:lineRule="auto"/>
-      </w:pPr>
-      <w:r>
-        <w:t xml:space="preserve">   received any funding for this work.</w:t>
+        <w:t xml:space="preserve">4. Two declarations the publication asks of every author. They sound formal and they are</w:t>
+      </w:r>
+    </w:p>
+    <w:p>
+      <w:pPr>
+        <w:spacing w:after="160" w:line="276" w:lineRule="auto"/>
+      </w:pPr>
+      <w:r>
+        <w:t xml:space="preserve">   genuinely routine. Something like this is all that is needed, and you can copy it straight</w:t>
+      </w:r>
+    </w:p>
+    <w:p>
+      <w:pPr>
+        <w:spacing w:after="160" w:line="276" w:lineRule="auto"/>
+      </w:pPr>
+      <w:r>
+        <w:t xml:space="preserve">   out if it is accurate:</w:t>
+      </w:r>
+    </w:p>
+    <w:p>
+      <w:pPr>
+        <w:spacing w:after="160" w:line="276" w:lineRule="auto"/>
+      </w:pPr>
+      <w:r>
+        <w:t xml:space="preserve">      "I have no financial or commercial interest in the Justification Review Standard.</w:t>
+      </w:r>
+    </w:p>
+    <w:p>
+      <w:pPr>
+        <w:spacing w:after="160" w:line="276" w:lineRule="auto"/>
+      </w:pPr>
+      <w:r>
+        <w:t xml:space="preserve">       I received no funding for this work."</w:t>
+      </w:r>
+    </w:p>
+    <w:p>
+      <w:pPr>
+        <w:spacing w:after="160" w:line="276" w:lineRule="auto"/>
+      </w:pPr>
+      <w:r>
+        <w:t xml:space="preserve">   If either is not quite right, just say what is. For example, if any of your time on this</w:t>
+      </w:r>
+    </w:p>
+    <w:p>
+      <w:pPr>
+        <w:spacing w:after="160" w:line="276" w:lineRule="auto"/>
+      </w:pPr>
+      <w:r>
+        <w:t xml:space="preserve">   was on an employer's clock, or if your firm has any relationship with the work, that goes</w:t>
+      </w:r>
+    </w:p>
+    <w:p>
+      <w:pPr>
+        <w:spacing w:after="160" w:line="276" w:lineRule="auto"/>
+      </w:pPr>
+      <w:r>
+        <w:t xml:space="preserve">   in and is completely normal to declare. There is no wrong answer, which is exactly why it</w:t>
+      </w:r>
+    </w:p>
+    <w:p>
+      <w:pPr>
+        <w:spacing w:after="160" w:line="276" w:lineRule="auto"/>
+      </w:pPr>
+      <w:r>
+        <w:t xml:space="preserve">   has to be in your words and not mine.</w:t>
       </w:r>
     </w:p>
     <w:p>
@@ -360,15 +448,39 @@
         <w:spacing w:after="60"/>
       </w:pPr>
       <w:r>
-        <w:t xml:space="preserve">5. A short professional bio, two or three lines. ISACA specifically asks authors to leave</w:t>
-      </w:r>
-    </w:p>
-    <w:p>
-      <w:pPr>
-        <w:spacing w:after="160" w:line="276" w:lineRule="auto"/>
-      </w:pPr>
-      <w:r>
-        <w:t xml:space="preserve">   education out, so current role, background and affiliations only.</w:t>
+        <w:t xml:space="preserve">5. A short professional bio, two or three lines. ISACA asks authors to leave education out,</w:t>
+      </w:r>
+    </w:p>
+    <w:p>
+      <w:pPr>
+        <w:spacing w:after="160" w:line="276" w:lineRule="auto"/>
+      </w:pPr>
+      <w:r>
+        <w:t xml:space="preserve">   so current role, background and affiliations only. Mine reads: "Phillip Wikes is an AI</w:t>
+      </w:r>
+    </w:p>
+    <w:p>
+      <w:pPr>
+        <w:spacing w:after="160" w:line="276" w:lineRule="auto"/>
+      </w:pPr>
+      <w:r>
+        <w:t xml:space="preserve">   Governance and Cognitive Risk Advisor focused on documentation integrity and record-level</w:t>
+      </w:r>
+    </w:p>
+    <w:p>
+      <w:pPr>
+        <w:spacing w:after="160" w:line="276" w:lineRule="auto"/>
+      </w:pPr>
+      <w:r>
+        <w:t xml:space="preserve">   controls in AI-assisted environments. He served as a Lead Civil Rights Officer at the</w:t>
+      </w:r>
+    </w:p>
+    <w:p>
+      <w:pPr>
+        <w:spacing w:after="160" w:line="276" w:lineRule="auto"/>
+      </w:pPr>
+      <w:r>
+        <w:t xml:space="preserve">   Maryland Commission on Civil Rights." Yours can be shorter.</w:t>
       </w:r>
     </w:p>
     <w:p>
@@ -384,23 +496,31 @@
         <w:spacing w:after="160" w:line="276" w:lineRule="auto"/>
       </w:pPr>
       <w:r>
-        <w:t xml:space="preserve">Thank you for staying with this since July. A section written by someone who has actually had</w:t>
-      </w:r>
-    </w:p>
-    <w:p>
-      <w:pPr>
-        <w:spacing w:after="160" w:line="276" w:lineRule="auto"/>
-      </w:pPr>
-      <w:r>
-        <w:t xml:space="preserve">to test a file under examination carries weight that I could not manufacture, and it is the</w:t>
-      </w:r>
-    </w:p>
-    <w:p>
-      <w:pPr>
-        <w:spacing w:after="160" w:line="276" w:lineRule="auto"/>
-      </w:pPr>
-      <w:r>
-        <w:t xml:space="preserve">part of this article an ISACA reader will recognise immediately.</w:t>
+        <w:t xml:space="preserve">Thank you again for staying with this since July, unpaid and on top of a demanding job. A</w:t>
+      </w:r>
+    </w:p>
+    <w:p>
+      <w:pPr>
+        <w:spacing w:after="160" w:line="276" w:lineRule="auto"/>
+      </w:pPr>
+      <w:r>
+        <w:t xml:space="preserve">section written by someone who has actually had to test a file under examination carries</w:t>
+      </w:r>
+    </w:p>
+    <w:p>
+      <w:pPr>
+        <w:spacing w:after="160" w:line="276" w:lineRule="auto"/>
+      </w:pPr>
+      <w:r>
+        <w:t xml:space="preserve">weight I could not manufacture, and it is the part of this article an ISACA reader will</w:t>
+      </w:r>
+    </w:p>
+    <w:p>
+      <w:pPr>
+        <w:spacing w:after="160" w:line="276" w:lineRule="auto"/>
+      </w:pPr>
+      <w:r>
+        <w:t xml:space="preserve">recognise immediately as real.</w:t>
       </w:r>
     </w:p>
     <w:p>
@@ -504,23 +624,61 @@
         <w:t xml:space="preserve">On inviting correction of the control section.</w:t>
       </w:r>
       <w:r>
-        <w:t xml:space="preserve"> That section is new, written from outside</w:t>
-      </w:r>
-    </w:p>
-    <w:p>
-      <w:pPr>
-        <w:spacing w:after="160" w:line="276" w:lineRule="auto"/>
-      </w:pPr>
-      <w:r>
-        <w:t xml:space="preserve">audit practice, and it is the most likely thing in the article to be wrong. Asking him</w:t>
-      </w:r>
-    </w:p>
-    <w:p>
-      <w:pPr>
-        <w:spacing w:after="160" w:line="276" w:lineRule="auto"/>
-      </w:pPr>
-      <w:r>
-        <w:t xml:space="preserve">directly is both honest and the fastest route to it being right.</w:t>
+        <w:t xml:space="preserve"> It is new, written from outside audit</w:t>
+      </w:r>
+    </w:p>
+    <w:p>
+      <w:pPr>
+        <w:spacing w:after="160" w:line="276" w:lineRule="auto"/>
+      </w:pPr>
+      <w:r>
+        <w:t xml:space="preserve">practice, and the most likely thing in the article to be wrong. Offering to cut it entirely</w:t>
+      </w:r>
+    </w:p>
+    <w:p>
+      <w:pPr>
+        <w:spacing w:after="160" w:line="276" w:lineRule="auto"/>
+      </w:pPr>
+      <w:r>
+        <w:t xml:space="preserve">rather than defend it is both honest and the fastest route to it being right.</w:t>
+      </w:r>
+    </w:p>
+    <w:p>
+      <w:pPr>
+        <w:spacing w:after="160" w:line="276" w:lineRule="auto"/>
+      </w:pPr>
+      <w:r>
+        <w:rPr>
+          <w:b/>
+        </w:rPr>
+        <w:t xml:space="preserve">On the declaration examples.</w:t>
+      </w:r>
+      <w:r>
+        <w:t xml:space="preserve"> Copyable wording removes the main reason people stall on</w:t>
+      </w:r>
+    </w:p>
+    <w:p>
+      <w:pPr>
+        <w:spacing w:after="160" w:line="276" w:lineRule="auto"/>
+      </w:pPr>
+      <w:r>
+        <w:t xml:space="preserve">these. His case is more likely than Tanvi's to have something real in the funding line, given</w:t>
+      </w:r>
+    </w:p>
+    <w:p>
+      <w:pPr>
+        <w:spacing w:after="160" w:line="276" w:lineRule="auto"/>
+      </w:pPr>
+      <w:r>
+        <w:t xml:space="preserve">a Big Four and Citi background, so the email names employer time explicitly as a normal thing</w:t>
+      </w:r>
+    </w:p>
+    <w:p>
+      <w:pPr>
+        <w:spacing w:after="160" w:line="276" w:lineRule="auto"/>
+      </w:pPr>
+      <w:r>
+        <w:t xml:space="preserve">to declare rather than a problem.</w:t>
       </w:r>
     </w:p>
     <w:p>
@@ -534,45 +692,23 @@
         <w:t xml:space="preserve">On the examples being optional.</w:t>
       </w:r>
       <w:r>
-        <w:t xml:space="preserve"> They have been outstanding since 18 July. Making them a</w:t>
-      </w:r>
-    </w:p>
-    <w:p>
-      <w:pPr>
-        <w:spacing w:after="160" w:line="276" w:lineRule="auto"/>
-      </w:pPr>
-      <w:r>
-        <w:t xml:space="preserve">blocker risks another month. The article is submittable without them and better with them,</w:t>
-      </w:r>
-    </w:p>
-    <w:p>
-      <w:pPr>
-        <w:spacing w:after="160" w:line="276" w:lineRule="auto"/>
-      </w:pPr>
-      <w:r>
-        <w:t xml:space="preserve">and the email says exactly that.</w:t>
-      </w:r>
-    </w:p>
-    <w:p>
-      <w:pPr>
-        <w:spacing w:after="160" w:line="276" w:lineRule="auto"/>
-      </w:pPr>
-      <w:r>
-        <w:rPr>
-          <w:b/>
-        </w:rPr>
-        <w:t xml:space="preserve">The five asks are numbered so one reply completes everything</w:t>
-      </w:r>
-      <w:r>
-        <w:t xml:space="preserve">: printed name, section</w:t>
-      </w:r>
-    </w:p>
-    <w:p>
-      <w:pPr>
-        <w:spacing w:after="160" w:line="276" w:lineRule="auto"/>
-      </w:pPr>
-      <w:r>
-        <w:t xml:space="preserve">approval, optional examples, both declarations, and the bio ISACA requires.</w:t>
+        <w:t xml:space="preserve"> Outstanding since 18 July. Making them a blocker risks</w:t>
+      </w:r>
+    </w:p>
+    <w:p>
+      <w:pPr>
+        <w:spacing w:after="160" w:line="276" w:lineRule="auto"/>
+      </w:pPr>
+      <w:r>
+        <w:t xml:space="preserve">another month. The article is submittable without them and better with them, and the email</w:t>
+      </w:r>
+    </w:p>
+    <w:p>
+      <w:pPr>
+        <w:spacing w:after="160" w:line="276" w:lineRule="auto"/>
+      </w:pPr>
+      <w:r>
+        <w:t xml:space="preserve">says exactly that.</w:t>
       </w:r>
     </w:p>
     <w:sectPr>

</xml_diff>